<commit_message>
Przeglądarka dokumentów docx pod /doc/ oraz projekt pisma o wstępnym zainteresowaniu dla wydawcy
Co-Authored-By: Claude Opus 5 <noreply@anthropic.com>
Claude-Session: https://claude.ai/code/session_01WR2JsPawQK6ge7oAFtsinp
</commit_message>
<xml_diff>
--- a/attachments/mk-list-intencyjny.docx
+++ b/attachments/mk-list-intencyjny.docx
@@ -4,204 +4,172 @@
   <w:body>
     <w:p>
       <w:pPr>
-        <w:spacing w:after="280"/>
+        <w:spacing w:before="0" w:after="200"/>
       </w:pPr>
       <w:r>
         <w:rPr>
-          <w:b w:val="0"/>
+          <w:b/>
+          <w:sz w:val="17"/>
         </w:rPr>
+        <w:t>PROJEKT POMOCNICZY, DO SWOBODNEJ ZMIANY LUB ODRZUCENIA.</w:t>
+      </w:r>
+      <w:r>
+        <w:rPr>
+          <w:sz w:val="17"/>
+        </w:rPr>
+        <w:t xml:space="preserve"> Treść poniższa jest propozycją wnioskodawcy; o formie i zakresie ewentualnego stanowiska rozstrzyga Ministerstwo.</w:t>
+      </w:r>
+    </w:p>
+    <w:p>
+      <w:pPr>
+        <w:spacing w:before="120" w:after="120"/>
+      </w:pPr>
+      <w:r>
         <w:t>[nagłówek Ministerstwa Kultury i Dziedzictwa Narodowego]</w:t>
       </w:r>
     </w:p>
     <w:p>
       <w:pPr>
-        <w:spacing w:after="40"/>
+        <w:spacing w:before="200" w:after="120"/>
       </w:pPr>
       <w:r>
-        <w:rPr>
-          <w:b w:val="0"/>
-        </w:rPr>
         <w:t>Warszawa, dnia ..........</w:t>
       </w:r>
     </w:p>
     <w:p>
       <w:pPr>
-        <w:spacing w:after="280"/>
+        <w:spacing w:before="0" w:after="240"/>
       </w:pPr>
       <w:r>
-        <w:rPr>
-          <w:b w:val="0"/>
-        </w:rPr>
         <w:t>Znak sprawy: ..........</w:t>
       </w:r>
     </w:p>
     <w:p>
       <w:pPr>
-        <w:spacing w:after="0"/>
+        <w:spacing w:before="0" w:after="120"/>
       </w:pPr>
       <w:r>
-        <w:rPr>
-          <w:b w:val="0"/>
-        </w:rPr>
         <w:t>Pan Krzysztof Olbiński</w:t>
       </w:r>
     </w:p>
     <w:p>
       <w:pPr>
-        <w:spacing w:after="0"/>
+        <w:spacing w:before="0" w:after="120"/>
       </w:pPr>
       <w:r>
-        <w:rPr>
-          <w:b w:val="0"/>
-        </w:rPr>
         <w:t>ul. 11 Listopada 12/1</w:t>
       </w:r>
     </w:p>
     <w:p>
       <w:pPr>
-        <w:spacing w:after="320"/>
+        <w:spacing w:before="0" w:after="280"/>
       </w:pPr>
       <w:r>
-        <w:rPr>
-          <w:b w:val="0"/>
-        </w:rPr>
         <w:t>98-200 Sieradz</w:t>
       </w:r>
     </w:p>
     <w:p>
       <w:pPr>
-        <w:spacing w:after="280"/>
+        <w:spacing w:before="0" w:after="0"/>
         <w:jc w:val="center"/>
       </w:pPr>
       <w:r>
         <w:rPr>
           <w:b/>
         </w:rPr>
-        <w:t>LIST INTENCYJNY</w:t>
+        <w:t>LIST INTENCYJNY / STANOWISKO DOTYCZĄCE KONCEPCJI NAGRODY KONSTELA</w:t>
       </w:r>
     </w:p>
     <w:p>
       <w:pPr>
-        <w:spacing w:after="160"/>
-        <w:jc w:val="both"/>
+        <w:spacing w:before="0" w:after="280"/>
+        <w:jc w:val="center"/>
       </w:pPr>
       <w:r>
         <w:rPr>
-          <w:b w:val="0"/>
+          <w:sz w:val="17"/>
         </w:rPr>
-        <w:t>Ministerstwo Kultury i Dziedzictwa Narodowego zapoznało się z przedstawioną koncepcją Nagrody Konstela - cyklicznej nagrody przyznawanej osobom prowadzącym pogłębione rozmowy z systemami sztucznej inteligencji - oraz z towarzyszącymi jej wydawnictwami: antologią najwyżej ocenionych rozmów każdej edycji, publikowaną nieodpłatnie, i publicznym Archiwum szerszego zbioru rozmów.</w:t>
+        <w:t>(tytuł do wyboru przez Ministerstwo, zależnie od przyjętej formy)</w:t>
       </w:r>
     </w:p>
     <w:p>
       <w:pPr>
-        <w:spacing w:after="160"/>
+        <w:spacing w:before="0" w:after="120"/>
         <w:jc w:val="both"/>
       </w:pPr>
       <w:r>
-        <w:rPr>
-          <w:b w:val="0"/>
-        </w:rPr>
-        <w:t>Ministerstwo stwierdza, że tematyka przedsięwzięcia wpisuje się w obszar upowszechniania kultury i czytelnictwa oraz dokumentowania dorobku polskojęzycznego. Powstający zbiór ma być zapisem tego, jak użytkownicy języka polskiego posługują się nowym narzędziem w okresie jego wchodzenia do powszechnego użytku. Ministerstwo odnotowuje również, że antologia i Archiwum mają być udostępniane bezpłatnie, bez rejestracji i bez ograniczeń dostępu.</w:t>
+        <w:t>Ministerstwo Kultury i Dziedzictwa Narodowego otrzymało opis koncepcji Nagrody Konstela - cyklicznej nagrody przyznawanej osobom prowadzącym pogłębione rozmowy z systemami sztucznej inteligencji - oraz towarzyszących jej publikacji: antologii najwyżej ocenionych rozmów każdej edycji, wydawanej nieodpłatnie, i publicznego Archiwum szerszego zbioru rozmów.</w:t>
       </w:r>
     </w:p>
     <w:p>
       <w:pPr>
-        <w:spacing w:after="160"/>
+        <w:spacing w:before="0" w:after="120"/>
         <w:jc w:val="both"/>
       </w:pPr>
       <w:r>
-        <w:rPr>
-          <w:b w:val="0"/>
-        </w:rPr>
-        <w:t>Niniejsze stanowisko odnosi się wyłącznie do zgodności tematyki przedsięwzięcia z obszarem działania Ministerstwa. Nie zawiera oceny jakości plebiscytu, jego regulaminu ani przyjętych kryteriów oceny, nie stanowi rekomendacji organizatora i nie jest zapewnieniem, że przedsięwzięcie zostanie zrealizowane.</w:t>
+        <w:t>Ministerstwo odnotowuje, że tematyka przedstawionego przedsięwzięcia dotyczy obszaru upowszechniania kultury i czytelnictwa oraz dokumentowania dorobku polskojęzycznego. Zgodnie z przedstawionymi założeniami powstający zbiór ma być zapisem tego, jak użytkownicy języka polskiego posługują się nowym narzędziem w okresie jego wchodzenia do powszechnego użytku, a antologia i Archiwum mają być udostępniane bezpłatnie, bez rejestracji i bez ograniczeń dostępu.</w:t>
       </w:r>
     </w:p>
     <w:p>
       <w:pPr>
-        <w:spacing w:after="160"/>
+        <w:spacing w:before="0" w:after="120"/>
         <w:jc w:val="both"/>
       </w:pPr>
       <w:r>
-        <w:rPr>
-          <w:b w:val="0"/>
-        </w:rPr>
+        <w:t>Niniejsze stanowisko odnosi się wyłącznie do tematyki przedsięwzięcia w odniesieniu do obszaru działania Ministerstwa i opiera się na opisie przedstawionym przez adresata. Nie zawiera oceny jakości plebiscytu, jego regulaminu ani przyjętych kryteriów oceny, nie stanowi rekomendacji organizatora i nie jest zapewnieniem, że przedsięwzięcie zostanie zrealizowane.</w:t>
+      </w:r>
+    </w:p>
+    <w:p>
+      <w:pPr>
+        <w:spacing w:before="0" w:after="120"/>
+        <w:jc w:val="both"/>
+      </w:pPr>
+      <w:r>
         <w:t>Niniejsze pismo nie stanowi przyznania patronatu honorowego, zobowiązania finansowego ani zobowiązania do podjęcia innych działań po stronie Ministerstwa. Nie przesądza ono w szczególności o sposobie rozpoznania ewentualnego wniosku o dofinansowanie złożonego w ramach Programów Ministra ani wniosku o patronat honorowy; każdy taki wniosek zostanie oceniony na zasadach ogólnych, określonych w regulaminie właściwego programu lub w trybie patronatowym.</w:t>
       </w:r>
     </w:p>
     <w:p>
       <w:pPr>
-        <w:spacing w:after="160"/>
+        <w:spacing w:before="0" w:after="120"/>
         <w:jc w:val="both"/>
       </w:pPr>
       <w:r>
-        <w:rPr>
-          <w:b w:val="0"/>
-        </w:rPr>
         <w:t>Adresat może posługiwać się niniejszym pismem w kontaktach z potencjalnymi partnerami i fundatorami Nagrody oraz publikować jego treść w całości, bez cytowania fragmentów w oderwaniu od pozostałych postanowień.</w:t>
       </w:r>
     </w:p>
     <w:p>
       <w:pPr>
-        <w:spacing w:after="440"/>
+        <w:spacing w:before="200" w:after="400"/>
       </w:pPr>
       <w:r>
-        <w:rPr>
-          <w:b w:val="0"/>
-        </w:rPr>
         <w:t>(pieczęć urzędowa)</w:t>
       </w:r>
     </w:p>
     <w:p>
       <w:pPr>
-        <w:spacing w:after="0"/>
+        <w:spacing w:before="0" w:after="120"/>
       </w:pPr>
       <w:r>
-        <w:rPr>
-          <w:b w:val="0"/>
-        </w:rPr>
         <w:t>..........................................</w:t>
       </w:r>
     </w:p>
     <w:p>
       <w:pPr>
-        <w:spacing w:after="240"/>
+        <w:spacing w:before="0" w:after="280"/>
       </w:pPr>
       <w:r>
-        <w:rPr>
-          <w:b w:val="0"/>
-        </w:rPr>
         <w:t>podpis, imię i nazwisko, stanowisko</w:t>
       </w:r>
     </w:p>
     <w:p>
       <w:pPr>
-        <w:spacing w:after="200"/>
+        <w:spacing w:before="0" w:after="120"/>
       </w:pPr>
       <w:r>
         <w:rPr>
-          <w:b w:val="0"/>
-          <w:sz w:val="18"/>
+          <w:sz w:val="17"/>
         </w:rPr>
         <w:t>Pismo może zostać opatrzone kwalifikowanym podpisem elektronicznym zamiast podpisu odręcznego i pieczęci.</w:t>
-      </w:r>
-    </w:p>
-    <w:p>
-      <w:pPr>
-        <w:spacing w:after="0"/>
-        <w:jc w:val="both"/>
-      </w:pPr>
-      <w:r>
-        <w:rPr>
-          <w:b/>
-          <w:sz w:val="18"/>
-        </w:rPr>
-        <w:t xml:space="preserve">PROJEKT POMOCNICZY, DO SWOBODNEJ ZMIANY LUB ODRZUCENIA. </w:t>
-      </w:r>
-      <w:r>
-        <w:rPr>
-          <w:sz w:val="18"/>
-        </w:rPr>
-        <w:t>Treść powyższa jest propozycją wnioskodawcy; o formie i zakresie ewentualnego stanowiska rozstrzyga Ministerstwo.</w:t>
       </w:r>
     </w:p>
     <w:sectPr>
@@ -578,7 +546,7 @@
     <w:qFormat/>
     <w:rsid w:val="00FC693F"/>
     <w:pPr>
-      <w:spacing w:before="0" w:after="120" w:line="240" w:lineRule="auto"/>
+      <w:spacing w:after="120" w:line="240" w:lineRule="auto"/>
     </w:pPr>
     <w:rPr>
       <w:rFonts w:ascii="Times New Roman" w:hAnsi="Times New Roman"/>

</xml_diff>